<commit_message>
feat(cad): video Modul 6 versi klik GUI (gambar kerja balok bertingkat)
- Rekaman klik GUI asli 12:54:
  - balok bertingkat 120 x 60 x 80 (Pad 60 Reversed) dan lubang Ø20 tembus lewat sketsa XY + Toggle Section View
  - lembar TechDraw dari template ISO A4 sudut ketiga, Projection Group 1:2 (Depan, Atas, Kanan)
  - material Steel-S275JR lewat View -> Material; tampilan Silver; isometrik padat (Active View) 1:2
  - Section View A-A berjudul POTONGAN A-A; dimensi hanya di Depan, Kanan, dan potongan, berjarak sama
  - kepala gambar: Approved by Dedik Romahadi, Part Material Steel-S275JR; bacaan luas 7.800 dan 6.800 mm²; ekspor PDF
- Template A4_Landscape_ISO5457_sudut_ketiga.svg untuk diunduh mahasiswa.
- Teks langkah 1-7 dan Gambar 7 disesuaikan dengan video.

Co-Authored-By: Claude Opus 5.5 <noreply@anthropic.com>
</commit_message>
<xml_diff>
--- a/Pemodelan-Computer-Aided-Design/Modul-Word/Modul-6-Sudut-Pandang-Proyeksi-dan-Manajemen-Tampilan-3D.docx
+++ b/Pemodelan-Computer-Aided-Design/Modul-Word/Modul-6-Sudut-Pandang-Proyeksi-dan-Manajemen-Tampilan-3D.docx
@@ -12046,7 +12046,7 @@
           <w:i w:val="0"/>
           <w:sz w:val="20"/>
         </w:rPr>
-        <w:t>Gambar 7 — Gambar kerja target praktik: balok bertingkat berlubang. Satuan mm; lembar A4 sudut ketiga skala 1:2 (langkah 3 dan 6). Balok dari langkah 1: profil tangga 120 × 80 dengan anak tangga 60 × 30 dibuang di kanan-atas, Pad 60, dan lubang ⌀20 tembus di muka atas tingkat rendah. Isometrik memakai arah (1, −1, 1) (langkah 4); potongan A-A melalui pusat lubang, 30 dari muka depan, dilihat ke arah −Y (langkah 5) sehingga kiri-kanannya terbalik terhadap pandangan Depan.</w:t>
+        <w:t>Gambar 7 — Gambar kerja target praktik: balok bertingkat berlubang. Satuan mm; lembar A4 sudut ketiga skala 1:2 (langkah 3 dan 6). Balok dari langkah 1: profil tangga 120 × 80 dengan anak tangga 60 × 30 dibuang di kanan-atas, Pad 60, dan lubang ⌀20 tembus di muka atas tingkat rendah. Isometrik memakai arah (1, −1, 1) (langkah 4); potongan A-A melalui pusat lubang, 30 dari muka depan, dilihat ke arah +Y (langkah 5) sehingga susunannya sama dengan pandangan Depan. Lubang ⌀20 berpusat 30 dari tepi kanan di tengah kedalaman.</w:t>
       </w:r>
     </w:p>
     <w:p>
@@ -12079,7 +12079,61 @@
           <w:i w:val="0"/>
           <w:sz w:val="22"/>
         </w:rPr>
-        <w:t>Body → Sketch XZ: profil tangga 6 titik (120 lebar, 80 tinggi; anak tangga 60 × 30 dibuang di kanan-atas), fully constrained → Pad 60. Sketch di muka atas tingkat rendah: lingkaran ⌀20 → Pocket Through all.</w:t>
+        <w:t xml:space="preserve">File → New Document; Part Design → New Body; Sketch → New Sketch → </w:t>
+      </w:r>
+      <w:r>
+        <w:rPr>
+          <w:rFonts w:ascii="Arial" w:hAnsi="Arial" w:eastAsia="Arial" w:cs="Arial"/>
+          <w:b/>
+          <w:i w:val="0"/>
+          <w:sz w:val="22"/>
+        </w:rPr>
+        <w:t>XZ-plane</w:t>
+      </w:r>
+      <w:r>
+        <w:rPr>
+          <w:rFonts w:ascii="Arial" w:hAnsi="Arial" w:eastAsia="Arial" w:cs="Arial"/>
+          <w:b w:val="0"/>
+          <w:i w:val="0"/>
+          <w:sz w:val="22"/>
+        </w:rPr>
+        <w:t xml:space="preserve">, lalu tekan 1 (Front) karena sketsa XZ tampil dari belakang. Polyline dari titik asal: profil tangga kasar 6 titik. Dimensi: tepi bawah 120, tepi kiri 80, tepi atas tingkat tinggi 60, tepi kanan 50 → Fully constrained; seret angka yang jatuh di dalam profil ke luar. Close → Pad 60, centang </w:t>
+      </w:r>
+      <w:r>
+        <w:rPr>
+          <w:rFonts w:ascii="Arial" w:hAnsi="Arial" w:eastAsia="Arial" w:cs="Arial"/>
+          <w:b w:val="0"/>
+          <w:i/>
+          <w:sz w:val="22"/>
+        </w:rPr>
+        <w:t>Reversed</w:t>
+      </w:r>
+      <w:r>
+        <w:rPr>
+          <w:rFonts w:ascii="Arial" w:hAnsi="Arial" w:eastAsia="Arial" w:cs="Arial"/>
+          <w:b w:val="0"/>
+          <w:i w:val="0"/>
+          <w:sz w:val="22"/>
+        </w:rPr>
+        <w:t xml:space="preserve"> agar benda tumbuh ke +Y dan muka depannya tetap di bidang XZ. Lubang: Sketch → New Sketch → XY-plane, lalu </w:t>
+      </w:r>
+      <w:r>
+        <w:rPr>
+          <w:rFonts w:ascii="Arial" w:hAnsi="Arial" w:eastAsia="Arial" w:cs="Arial"/>
+          <w:b/>
+          <w:i w:val="0"/>
+          <w:sz w:val="22"/>
+        </w:rPr>
+        <w:t>Sketch → Toggle Section View</w:t>
+      </w:r>
+      <w:r>
+        <w:rPr>
+          <w:rFonts w:ascii="Arial" w:hAnsi="Arial" w:eastAsia="Arial" w:cs="Arial"/>
+          <w:b w:val="0"/>
+          <w:i w:val="0"/>
+          <w:sz w:val="22"/>
+        </w:rPr>
+        <w:t xml:space="preserve"> (bagian benda di atas bidang sketsa disembunyikan); Circle → Diameter 20, Horizontal 90, Vertical 30; Close → Pocket Through all, centang Reversed. Volume 452.292,04 mm³.</w:t>
       </w:r>
     </w:p>
     <w:p>
@@ -12112,7 +12166,7 @@
           <w:i w:val="0"/>
           <w:sz w:val="22"/>
         </w:rPr>
-        <w:t>Tekan 0, 1, 2, 3 lalu V, F; bandingkan V, O dan V, P dengan memutar model (Navigation cube). Simpan sudut kerja lewat View → Freeze display → Save views.</w:t>
+        <w:t>Di area 3D tekan 1 (Front), 2 (Top), 3 (Right), 0 (isometrik). V lalu P: kamera perspektif (rusuk sejajar tampak menguncup); V lalu O: kembali ortografik untuk kerja dan TechDraw; V lalu F: tampilkan semua.</w:t>
       </w:r>
     </w:p>
     <w:p>
@@ -12145,7 +12199,43 @@
           <w:i w:val="0"/>
           <w:sz w:val="22"/>
         </w:rPr>
-        <w:t>TechDraw → Insert Page using Template (A4 Landscape ISO). Pilih Body → Insert Projection Group: Front dari arah −Y, centang Top dan Right, Projection Type Third Angle, Scale Custom 1:2. Geser grup ke tengah lembar.</w:t>
+        <w:t xml:space="preserve">Workbench TechDraw → Page → New Page From Template → A4_Landscape_ISO5457_sudut_ketiga.svg (template ISO A4 FreeCAD dengan simbol sudut ketiga; unduh dulu). Pilih Body → TechDraw Views → </w:t>
+      </w:r>
+      <w:r>
+        <w:rPr>
+          <w:rFonts w:ascii="Arial" w:hAnsi="Arial" w:eastAsia="Arial" w:cs="Arial"/>
+          <w:b/>
+          <w:i w:val="0"/>
+          <w:sz w:val="22"/>
+        </w:rPr>
+        <w:t>Projection Group</w:t>
+      </w:r>
+      <w:r>
+        <w:rPr>
+          <w:rFonts w:ascii="Arial" w:hAnsi="Arial" w:eastAsia="Arial" w:cs="Arial"/>
+          <w:b w:val="0"/>
+          <w:i w:val="0"/>
+          <w:sz w:val="22"/>
+        </w:rPr>
+        <w:t xml:space="preserve">: tombol Front (arah depan dokumen), Projection </w:t>
+      </w:r>
+      <w:r>
+        <w:rPr>
+          <w:rFonts w:ascii="Arial" w:hAnsi="Arial" w:eastAsia="Arial" w:cs="Arial"/>
+          <w:b w:val="0"/>
+          <w:i/>
+          <w:sz w:val="22"/>
+        </w:rPr>
+        <w:t>Third angle</w:t>
+      </w:r>
+      <w:r>
+        <w:rPr>
+          <w:rFonts w:ascii="Arial" w:hAnsi="Arial" w:eastAsia="Arial" w:cs="Arial"/>
+          <w:b w:val="0"/>
+          <w:i w:val="0"/>
+          <w:sz w:val="22"/>
+        </w:rPr>
+        <w:t>, centang Top dan Right, Scale Custom 1:2, X/Y spacing 25 → OK. Data → X 75, Y 100, Recompute: pandangan Atas di atas Depan, Kanan di kanan, lega dari bingkai dan kepala gambar.</w:t>
       </w:r>
     </w:p>
     <w:p>
@@ -12169,16 +12259,106 @@
           <w:i w:val="0"/>
           <w:sz w:val="22"/>
         </w:rPr>
-        <w:t xml:space="preserve">Pandangan isometrik: </w:t>
-      </w:r>
-      <w:r>
-        <w:rPr>
-          <w:rFonts w:ascii="Arial" w:hAnsi="Arial" w:eastAsia="Arial" w:cs="Arial"/>
-          <w:b w:val="0"/>
-          <w:i w:val="0"/>
-          <w:sz w:val="22"/>
-        </w:rPr>
-        <w:t>Pada Projection Group centang FrontTopRight (iso) atau Insert View dengan Direction (1, −1, 1). Perhatikan rusuk digambar skala penuh, bukan 0,816.</w:t>
+        <w:t xml:space="preserve">Isometrik padat: </w:t>
+      </w:r>
+      <w:r>
+        <w:rPr>
+          <w:rFonts w:ascii="Arial" w:hAnsi="Arial" w:eastAsia="Arial" w:cs="Arial"/>
+          <w:b w:val="0"/>
+          <w:i w:val="0"/>
+          <w:sz w:val="22"/>
+        </w:rPr>
+        <w:t xml:space="preserve">Di tab 3D: pilih Body → View → </w:t>
+      </w:r>
+      <w:r>
+        <w:rPr>
+          <w:rFonts w:ascii="Arial" w:hAnsi="Arial" w:eastAsia="Arial" w:cs="Arial"/>
+          <w:b/>
+          <w:i w:val="0"/>
+          <w:sz w:val="22"/>
+        </w:rPr>
+        <w:t>Material</w:t>
+      </w:r>
+      <w:r>
+        <w:rPr>
+          <w:rFonts w:ascii="Arial" w:hAnsi="Arial" w:eastAsia="Arial" w:cs="Arial"/>
+          <w:b w:val="0"/>
+          <w:i w:val="0"/>
+          <w:sz w:val="22"/>
+        </w:rPr>
+        <w:t xml:space="preserve"> → Standard → Metal → Steel → </w:t>
+      </w:r>
+      <w:r>
+        <w:rPr>
+          <w:rFonts w:ascii="Arial" w:hAnsi="Arial" w:eastAsia="Arial" w:cs="Arial"/>
+          <w:b w:val="0"/>
+          <w:i/>
+          <w:sz w:val="22"/>
+        </w:rPr>
+        <w:t>Steel-S275JR</w:t>
+      </w:r>
+      <w:r>
+        <w:rPr>
+          <w:rFonts w:ascii="Arial" w:hAnsi="Arial" w:eastAsia="Arial" w:cs="Arial"/>
+          <w:b w:val="0"/>
+          <w:i w:val="0"/>
+          <w:sz w:val="22"/>
+        </w:rPr>
+        <w:t xml:space="preserve"> → Close (material benda beserta sifat fisiknya). Karena tampilan bawaan baja FreeCAD hampir hitam, pilih lagi Body → View → Appearance → material tampilan </w:t>
+      </w:r>
+      <w:r>
+        <w:rPr>
+          <w:rFonts w:ascii="Arial" w:hAnsi="Arial" w:eastAsia="Arial" w:cs="Arial"/>
+          <w:b w:val="0"/>
+          <w:i/>
+          <w:sz w:val="22"/>
+        </w:rPr>
+        <w:t>Silver</w:t>
+      </w:r>
+      <w:r>
+        <w:rPr>
+          <w:rFonts w:ascii="Arial" w:hAnsi="Arial" w:eastAsia="Arial" w:cs="Arial"/>
+          <w:b w:val="0"/>
+          <w:i w:val="0"/>
+          <w:sz w:val="22"/>
+        </w:rPr>
+        <w:t xml:space="preserve"> (abu-abu logam), tekan 0 lalu Fit All. Di lembar: TechDraw → Views From Other Workbenches → </w:t>
+      </w:r>
+      <w:r>
+        <w:rPr>
+          <w:rFonts w:ascii="Arial" w:hAnsi="Arial" w:eastAsia="Arial" w:cs="Arial"/>
+          <w:b/>
+          <w:i w:val="0"/>
+          <w:sz w:val="22"/>
+        </w:rPr>
+        <w:t>Active View</w:t>
+      </w:r>
+      <w:r>
+        <w:rPr>
+          <w:rFonts w:ascii="Arial" w:hAnsi="Arial" w:eastAsia="Arial" w:cs="Arial"/>
+          <w:b w:val="0"/>
+          <w:i w:val="0"/>
+          <w:sz w:val="22"/>
+        </w:rPr>
+        <w:t xml:space="preserve">, centang </w:t>
+      </w:r>
+      <w:r>
+        <w:rPr>
+          <w:rFonts w:ascii="Arial" w:hAnsi="Arial" w:eastAsia="Arial" w:cs="Arial"/>
+          <w:b w:val="0"/>
+          <w:i/>
+          <w:sz w:val="22"/>
+        </w:rPr>
+        <w:t>No background</w:t>
+      </w:r>
+      <w:r>
+        <w:rPr>
+          <w:rFonts w:ascii="Arial" w:hAnsi="Arial" w:eastAsia="Arial" w:cs="Arial"/>
+          <w:b w:val="0"/>
+          <w:i w:val="0"/>
+          <w:sz w:val="22"/>
+        </w:rPr>
+        <w:t xml:space="preserve"> → OK: citra 3D berbayang masuk ke lembar. Data → Scale 0,761 agar lebar benda 63,6 mm (isometrik 1:2 = ½ × 180 × cos 30° × 0,816), X 172, Y 160 di atas pandangan Kanan.</w:t>
       </w:r>
     </w:p>
     <w:p>
@@ -12211,7 +12391,61 @@
           <w:i w:val="0"/>
           <w:sz w:val="22"/>
         </w:rPr>
-        <w:t>Pilih pandangan Top → Insert Section View: bidang melalui pusat lubang sejajar X, arah panah ke −Y, nama A. Tambahkan Hatch pada muka potongan dan periksa bagian di balik bidang.</w:t>
+        <w:t xml:space="preserve">Pilih pandangan Top → TechDraw Views → </w:t>
+      </w:r>
+      <w:r>
+        <w:rPr>
+          <w:rFonts w:ascii="Arial" w:hAnsi="Arial" w:eastAsia="Arial" w:cs="Arial"/>
+          <w:b/>
+          <w:i w:val="0"/>
+          <w:sz w:val="22"/>
+        </w:rPr>
+        <w:t>Section View</w:t>
+      </w:r>
+      <w:r>
+        <w:rPr>
+          <w:rFonts w:ascii="Arial" w:hAnsi="Arial" w:eastAsia="Arial" w:cs="Arial"/>
+          <w:b w:val="0"/>
+          <w:i w:val="0"/>
+          <w:sz w:val="22"/>
+        </w:rPr>
+        <w:t xml:space="preserve">: tombol </w:t>
+      </w:r>
+      <w:r>
+        <w:rPr>
+          <w:rFonts w:ascii="Arial" w:hAnsi="Arial" w:eastAsia="Arial" w:cs="Arial"/>
+          <w:b w:val="0"/>
+          <w:i/>
+          <w:sz w:val="22"/>
+        </w:rPr>
+        <w:t>Looking up</w:t>
+      </w:r>
+      <w:r>
+        <w:rPr>
+          <w:rFonts w:ascii="Arial" w:hAnsi="Arial" w:eastAsia="Arial" w:cs="Arial"/>
+          <w:b w:val="0"/>
+          <w:i w:val="0"/>
+          <w:sz w:val="22"/>
+        </w:rPr>
+        <w:t xml:space="preserve"> dulu (arah pandang +Y, searah pandangan Depan; kotak Identifier baru aktif setelah arah dipilih), lalu Identifier A; titik asal bidang potong (60, 30, 40) melewati pusat lubang → OK. Data → X 245, Y 100 (sebaris dengan Depan dan Kanan); </w:t>
+      </w:r>
+      <w:r>
+        <w:rPr>
+          <w:rFonts w:ascii="Arial" w:hAnsi="Arial" w:eastAsia="Arial" w:cs="Arial"/>
+          <w:b w:val="0"/>
+          <w:i/>
+          <w:sz w:val="22"/>
+        </w:rPr>
+        <w:t>Caption</w:t>
+      </w:r>
+      <w:r>
+        <w:rPr>
+          <w:rFonts w:ascii="Arial" w:hAnsi="Arial" w:eastAsia="Arial" w:cs="Arial"/>
+          <w:b w:val="0"/>
+          <w:i w:val="0"/>
+          <w:sz w:val="22"/>
+        </w:rPr>
+        <w:t xml:space="preserve"> “POTONGAN A-A”. Muka potongan diarsir otomatis.</w:t>
       </w:r>
     </w:p>
     <w:p>
@@ -12235,16 +12469,70 @@
           <w:i w:val="0"/>
           <w:sz w:val="22"/>
         </w:rPr>
-        <w:t xml:space="preserve">Dimensi, simbol, ekspor: </w:t>
-      </w:r>
-      <w:r>
-        <w:rPr>
-          <w:rFonts w:ascii="Arial" w:hAnsi="Arial" w:eastAsia="Arial" w:cs="Arial"/>
-          <w:b w:val="0"/>
-          <w:i w:val="0"/>
-          <w:sz w:val="22"/>
-        </w:rPr>
-        <w:t>Beri dimensi Length pada lebar dan tinggi, Diameter pada lubang; tulis metode proyeksi dan skala pada kepala gambar (simbol kerucut terpancung). Export Page as PDF.</w:t>
+        <w:t xml:space="preserve">Kepala gambar dan dimensi: </w:t>
+      </w:r>
+      <w:r>
+        <w:rPr>
+          <w:rFonts w:ascii="Arial" w:hAnsi="Arial" w:eastAsia="Arial" w:cs="Arial"/>
+          <w:b w:val="0"/>
+          <w:i w:val="0"/>
+          <w:sz w:val="22"/>
+        </w:rPr>
+        <w:t xml:space="preserve">Klik kolom kepala gambar: Title, Created by, Approved by (nama dosen pengampu), Document type, Part Material (ganti teks contoh template “Stainless steel Mat.No. 1.4301” dengan nama material yang dipasang: </w:t>
+      </w:r>
+      <w:r>
+        <w:rPr>
+          <w:rFonts w:ascii="Arial" w:hAnsi="Arial" w:eastAsia="Arial" w:cs="Arial"/>
+          <w:b w:val="0"/>
+          <w:i/>
+          <w:sz w:val="22"/>
+        </w:rPr>
+        <w:t>Steel-S275JR</w:t>
+      </w:r>
+      <w:r>
+        <w:rPr>
+          <w:rFonts w:ascii="Arial" w:hAnsi="Arial" w:eastAsia="Arial" w:cs="Arial"/>
+          <w:b w:val="0"/>
+          <w:i w:val="0"/>
+          <w:sz w:val="22"/>
+        </w:rPr>
+        <w:t xml:space="preserve">), Scale “1 : 2”. Klik tepi lubang di pandangan Atas → Circle Centerlines. Pandangan Atas memuat garis potong A-A, jadi </w:t>
+      </w:r>
+      <w:r>
+        <w:rPr>
+          <w:rFonts w:ascii="Arial" w:hAnsi="Arial" w:eastAsia="Arial" w:cs="Arial"/>
+          <w:b/>
+          <w:i w:val="0"/>
+          <w:sz w:val="22"/>
+        </w:rPr>
+        <w:t>tidak diberi dimensi</w:t>
+      </w:r>
+      <w:r>
+        <w:rPr>
+          <w:rFonts w:ascii="Arial" w:hAnsi="Arial" w:eastAsia="Arial" w:cs="Arial"/>
+          <w:b w:val="0"/>
+          <w:i w:val="0"/>
+          <w:sz w:val="22"/>
+        </w:rPr>
+        <w:t xml:space="preserve"> (angka akan menumpuk teks A-A). Depan: 120 (bawah) dan 60 (atas) dengan Length, 80 (kiri) dan 50 (kanan) dengan Vertical Length; Kanan: kedalaman 60 di bawah; Potongan A-A: rantai di atas, tepi kiri ke tepi celah 80 lalu lebar celah 20 → Format/Organize Dimensions → </w:t>
+      </w:r>
+      <w:r>
+        <w:rPr>
+          <w:rFonts w:ascii="Arial" w:hAnsi="Arial" w:eastAsia="Arial" w:cs="Arial"/>
+          <w:b w:val="0"/>
+          <w:i/>
+          <w:sz w:val="22"/>
+        </w:rPr>
+        <w:t>Insert ⌀ Prefix</w:t>
+      </w:r>
+      <w:r>
+        <w:rPr>
+          <w:rFonts w:ascii="Arial" w:hAnsi="Arial" w:eastAsia="Arial" w:cs="Arial"/>
+          <w:b w:val="0"/>
+          <w:i w:val="0"/>
+          <w:sz w:val="22"/>
+        </w:rPr>
+        <w:t xml:space="preserve"> menjadi ⌀20. Seret angka sehingga semua garis dimensi berjarak sama, 12 mm dari benda: angka dimensi di kanan benda berada di antara benda dan garisnya, jadi jarak ini memberi celah yang cukup.</w:t>
       </w:r>
     </w:p>
     <w:p>
@@ -12268,16 +12556,16 @@
           <w:i w:val="0"/>
           <w:sz w:val="22"/>
         </w:rPr>
-        <w:t xml:space="preserve">Bacaan dan simpan: </w:t>
-      </w:r>
-      <w:r>
-        <w:rPr>
-          <w:rFonts w:ascii="Arial" w:hAnsi="Arial" w:eastAsia="Arial" w:cs="Arial"/>
-          <w:b w:val="0"/>
-          <w:i w:val="0"/>
-          <w:sz w:val="22"/>
-        </w:rPr>
-        <w:t>Di Python: luas muka depan (Face.Area), BoundBox.DiagonalLength, luas potongan lewat slice pada bidang tengah kedalaman, y = (BoundBox.YMin + BoundBox.YMax)/2 = −30 (Pad dari sketsa XZ mengarah ke −Y); putar Body 25° terhadap Z dan baca XLength, lalu kembalikan ke 0°. Ctrl+S → Latihan6_NIM.FCStd (lembar TechDraw ikut tersimpan).</w:t>
+        <w:t xml:space="preserve">Bacaan, simpan, ekspor: </w:t>
+      </w:r>
+      <w:r>
+        <w:rPr>
+          <w:rFonts w:ascii="Arial" w:hAnsi="Arial" w:eastAsia="Arial" w:cs="Arial"/>
+          <w:b w:val="0"/>
+          <w:i w:val="0"/>
+          <w:sz w:val="22"/>
+        </w:rPr>
+        <w:t>Python console: luas muka depan [round(f.Area, 2) for f in App.ActiveDocument.Body.Shape.Faces if abs(f.CenterOfMass.y) &lt; 1e-6] → 7.800,0 mm²; luas potongan A-A pada y = 30: import Part lalu round(sum(Part.Face(w).Area for w in App.ActiveDocument.Body.Shape.slice(App.Vector(0, 1, 0), 30)), 2) → 6.800,0 mm² (= 7.800 − 20 × 50). Ctrl+S → Latihan6_NIM.FCStd (lembar TechDraw ikut tersimpan); File → Export PDF → Latihan6_NIM.pdf.</w:t>
       </w:r>
     </w:p>
     <w:p>

</xml_diff>

<commit_message>
feat(cad): video Modul 6 versi klik GUI (gambar kerja balok bertingkat) (#1041)
- Rekaman klik GUI asli 12:54:
  - balok bertingkat 120 x 60 x 80 (Pad 60 Reversed) dan lubang Ø20 tembus lewat sketsa XY + Toggle Section View
  - lembar TechDraw dari template ISO A4 sudut ketiga, Projection Group 1:2 (Depan, Atas, Kanan)
  - material Steel-S275JR lewat View -> Material; tampilan Silver; isometrik padat (Active View) 1:2
  - Section View A-A berjudul POTONGAN A-A; dimensi hanya di Depan, Kanan, dan potongan, berjarak sama
  - kepala gambar: Approved by Dedik Romahadi, Part Material Steel-S275JR; bacaan luas 7.800 dan 6.800 mm²; ekspor PDF
- Template A4_Landscape_ISO5457_sudut_ketiga.svg untuk diunduh mahasiswa.
- Teks langkah 1-7 dan Gambar 7 disesuaikan dengan video.

Co-authored-by: Claude Opus 5.5 <noreply@anthropic.com>
</commit_message>
<xml_diff>
--- a/Pemodelan-Computer-Aided-Design/Modul-Word/Modul-6-Sudut-Pandang-Proyeksi-dan-Manajemen-Tampilan-3D.docx
+++ b/Pemodelan-Computer-Aided-Design/Modul-Word/Modul-6-Sudut-Pandang-Proyeksi-dan-Manajemen-Tampilan-3D.docx
@@ -12046,7 +12046,7 @@
           <w:i w:val="0"/>
           <w:sz w:val="20"/>
         </w:rPr>
-        <w:t>Gambar 7 — Gambar kerja target praktik: balok bertingkat berlubang. Satuan mm; lembar A4 sudut ketiga skala 1:2 (langkah 3 dan 6). Balok dari langkah 1: profil tangga 120 × 80 dengan anak tangga 60 × 30 dibuang di kanan-atas, Pad 60, dan lubang ⌀20 tembus di muka atas tingkat rendah. Isometrik memakai arah (1, −1, 1) (langkah 4); potongan A-A melalui pusat lubang, 30 dari muka depan, dilihat ke arah −Y (langkah 5) sehingga kiri-kanannya terbalik terhadap pandangan Depan.</w:t>
+        <w:t>Gambar 7 — Gambar kerja target praktik: balok bertingkat berlubang. Satuan mm; lembar A4 sudut ketiga skala 1:2 (langkah 3 dan 6). Balok dari langkah 1: profil tangga 120 × 80 dengan anak tangga 60 × 30 dibuang di kanan-atas, Pad 60, dan lubang ⌀20 tembus di muka atas tingkat rendah. Isometrik memakai arah (1, −1, 1) (langkah 4); potongan A-A melalui pusat lubang, 30 dari muka depan, dilihat ke arah +Y (langkah 5) sehingga susunannya sama dengan pandangan Depan. Lubang ⌀20 berpusat 30 dari tepi kanan di tengah kedalaman.</w:t>
       </w:r>
     </w:p>
     <w:p>
@@ -12079,7 +12079,61 @@
           <w:i w:val="0"/>
           <w:sz w:val="22"/>
         </w:rPr>
-        <w:t>Body → Sketch XZ: profil tangga 6 titik (120 lebar, 80 tinggi; anak tangga 60 × 30 dibuang di kanan-atas), fully constrained → Pad 60. Sketch di muka atas tingkat rendah: lingkaran ⌀20 → Pocket Through all.</w:t>
+        <w:t xml:space="preserve">File → New Document; Part Design → New Body; Sketch → New Sketch → </w:t>
+      </w:r>
+      <w:r>
+        <w:rPr>
+          <w:rFonts w:ascii="Arial" w:hAnsi="Arial" w:eastAsia="Arial" w:cs="Arial"/>
+          <w:b/>
+          <w:i w:val="0"/>
+          <w:sz w:val="22"/>
+        </w:rPr>
+        <w:t>XZ-plane</w:t>
+      </w:r>
+      <w:r>
+        <w:rPr>
+          <w:rFonts w:ascii="Arial" w:hAnsi="Arial" w:eastAsia="Arial" w:cs="Arial"/>
+          <w:b w:val="0"/>
+          <w:i w:val="0"/>
+          <w:sz w:val="22"/>
+        </w:rPr>
+        <w:t xml:space="preserve">, lalu tekan 1 (Front) karena sketsa XZ tampil dari belakang. Polyline dari titik asal: profil tangga kasar 6 titik. Dimensi: tepi bawah 120, tepi kiri 80, tepi atas tingkat tinggi 60, tepi kanan 50 → Fully constrained; seret angka yang jatuh di dalam profil ke luar. Close → Pad 60, centang </w:t>
+      </w:r>
+      <w:r>
+        <w:rPr>
+          <w:rFonts w:ascii="Arial" w:hAnsi="Arial" w:eastAsia="Arial" w:cs="Arial"/>
+          <w:b w:val="0"/>
+          <w:i/>
+          <w:sz w:val="22"/>
+        </w:rPr>
+        <w:t>Reversed</w:t>
+      </w:r>
+      <w:r>
+        <w:rPr>
+          <w:rFonts w:ascii="Arial" w:hAnsi="Arial" w:eastAsia="Arial" w:cs="Arial"/>
+          <w:b w:val="0"/>
+          <w:i w:val="0"/>
+          <w:sz w:val="22"/>
+        </w:rPr>
+        <w:t xml:space="preserve"> agar benda tumbuh ke +Y dan muka depannya tetap di bidang XZ. Lubang: Sketch → New Sketch → XY-plane, lalu </w:t>
+      </w:r>
+      <w:r>
+        <w:rPr>
+          <w:rFonts w:ascii="Arial" w:hAnsi="Arial" w:eastAsia="Arial" w:cs="Arial"/>
+          <w:b/>
+          <w:i w:val="0"/>
+          <w:sz w:val="22"/>
+        </w:rPr>
+        <w:t>Sketch → Toggle Section View</w:t>
+      </w:r>
+      <w:r>
+        <w:rPr>
+          <w:rFonts w:ascii="Arial" w:hAnsi="Arial" w:eastAsia="Arial" w:cs="Arial"/>
+          <w:b w:val="0"/>
+          <w:i w:val="0"/>
+          <w:sz w:val="22"/>
+        </w:rPr>
+        <w:t xml:space="preserve"> (bagian benda di atas bidang sketsa disembunyikan); Circle → Diameter 20, Horizontal 90, Vertical 30; Close → Pocket Through all, centang Reversed. Volume 452.292,04 mm³.</w:t>
       </w:r>
     </w:p>
     <w:p>
@@ -12112,7 +12166,7 @@
           <w:i w:val="0"/>
           <w:sz w:val="22"/>
         </w:rPr>
-        <w:t>Tekan 0, 1, 2, 3 lalu V, F; bandingkan V, O dan V, P dengan memutar model (Navigation cube). Simpan sudut kerja lewat View → Freeze display → Save views.</w:t>
+        <w:t>Di area 3D tekan 1 (Front), 2 (Top), 3 (Right), 0 (isometrik). V lalu P: kamera perspektif (rusuk sejajar tampak menguncup); V lalu O: kembali ortografik untuk kerja dan TechDraw; V lalu F: tampilkan semua.</w:t>
       </w:r>
     </w:p>
     <w:p>
@@ -12145,7 +12199,43 @@
           <w:i w:val="0"/>
           <w:sz w:val="22"/>
         </w:rPr>
-        <w:t>TechDraw → Insert Page using Template (A4 Landscape ISO). Pilih Body → Insert Projection Group: Front dari arah −Y, centang Top dan Right, Projection Type Third Angle, Scale Custom 1:2. Geser grup ke tengah lembar.</w:t>
+        <w:t xml:space="preserve">Workbench TechDraw → Page → New Page From Template → A4_Landscape_ISO5457_sudut_ketiga.svg (template ISO A4 FreeCAD dengan simbol sudut ketiga; unduh dulu). Pilih Body → TechDraw Views → </w:t>
+      </w:r>
+      <w:r>
+        <w:rPr>
+          <w:rFonts w:ascii="Arial" w:hAnsi="Arial" w:eastAsia="Arial" w:cs="Arial"/>
+          <w:b/>
+          <w:i w:val="0"/>
+          <w:sz w:val="22"/>
+        </w:rPr>
+        <w:t>Projection Group</w:t>
+      </w:r>
+      <w:r>
+        <w:rPr>
+          <w:rFonts w:ascii="Arial" w:hAnsi="Arial" w:eastAsia="Arial" w:cs="Arial"/>
+          <w:b w:val="0"/>
+          <w:i w:val="0"/>
+          <w:sz w:val="22"/>
+        </w:rPr>
+        <w:t xml:space="preserve">: tombol Front (arah depan dokumen), Projection </w:t>
+      </w:r>
+      <w:r>
+        <w:rPr>
+          <w:rFonts w:ascii="Arial" w:hAnsi="Arial" w:eastAsia="Arial" w:cs="Arial"/>
+          <w:b w:val="0"/>
+          <w:i/>
+          <w:sz w:val="22"/>
+        </w:rPr>
+        <w:t>Third angle</w:t>
+      </w:r>
+      <w:r>
+        <w:rPr>
+          <w:rFonts w:ascii="Arial" w:hAnsi="Arial" w:eastAsia="Arial" w:cs="Arial"/>
+          <w:b w:val="0"/>
+          <w:i w:val="0"/>
+          <w:sz w:val="22"/>
+        </w:rPr>
+        <w:t>, centang Top dan Right, Scale Custom 1:2, X/Y spacing 25 → OK. Data → X 75, Y 100, Recompute: pandangan Atas di atas Depan, Kanan di kanan, lega dari bingkai dan kepala gambar.</w:t>
       </w:r>
     </w:p>
     <w:p>
@@ -12169,16 +12259,106 @@
           <w:i w:val="0"/>
           <w:sz w:val="22"/>
         </w:rPr>
-        <w:t xml:space="preserve">Pandangan isometrik: </w:t>
-      </w:r>
-      <w:r>
-        <w:rPr>
-          <w:rFonts w:ascii="Arial" w:hAnsi="Arial" w:eastAsia="Arial" w:cs="Arial"/>
-          <w:b w:val="0"/>
-          <w:i w:val="0"/>
-          <w:sz w:val="22"/>
-        </w:rPr>
-        <w:t>Pada Projection Group centang FrontTopRight (iso) atau Insert View dengan Direction (1, −1, 1). Perhatikan rusuk digambar skala penuh, bukan 0,816.</w:t>
+        <w:t xml:space="preserve">Isometrik padat: </w:t>
+      </w:r>
+      <w:r>
+        <w:rPr>
+          <w:rFonts w:ascii="Arial" w:hAnsi="Arial" w:eastAsia="Arial" w:cs="Arial"/>
+          <w:b w:val="0"/>
+          <w:i w:val="0"/>
+          <w:sz w:val="22"/>
+        </w:rPr>
+        <w:t xml:space="preserve">Di tab 3D: pilih Body → View → </w:t>
+      </w:r>
+      <w:r>
+        <w:rPr>
+          <w:rFonts w:ascii="Arial" w:hAnsi="Arial" w:eastAsia="Arial" w:cs="Arial"/>
+          <w:b/>
+          <w:i w:val="0"/>
+          <w:sz w:val="22"/>
+        </w:rPr>
+        <w:t>Material</w:t>
+      </w:r>
+      <w:r>
+        <w:rPr>
+          <w:rFonts w:ascii="Arial" w:hAnsi="Arial" w:eastAsia="Arial" w:cs="Arial"/>
+          <w:b w:val="0"/>
+          <w:i w:val="0"/>
+          <w:sz w:val="22"/>
+        </w:rPr>
+        <w:t xml:space="preserve"> → Standard → Metal → Steel → </w:t>
+      </w:r>
+      <w:r>
+        <w:rPr>
+          <w:rFonts w:ascii="Arial" w:hAnsi="Arial" w:eastAsia="Arial" w:cs="Arial"/>
+          <w:b w:val="0"/>
+          <w:i/>
+          <w:sz w:val="22"/>
+        </w:rPr>
+        <w:t>Steel-S275JR</w:t>
+      </w:r>
+      <w:r>
+        <w:rPr>
+          <w:rFonts w:ascii="Arial" w:hAnsi="Arial" w:eastAsia="Arial" w:cs="Arial"/>
+          <w:b w:val="0"/>
+          <w:i w:val="0"/>
+          <w:sz w:val="22"/>
+        </w:rPr>
+        <w:t xml:space="preserve"> → Close (material benda beserta sifat fisiknya). Karena tampilan bawaan baja FreeCAD hampir hitam, pilih lagi Body → View → Appearance → material tampilan </w:t>
+      </w:r>
+      <w:r>
+        <w:rPr>
+          <w:rFonts w:ascii="Arial" w:hAnsi="Arial" w:eastAsia="Arial" w:cs="Arial"/>
+          <w:b w:val="0"/>
+          <w:i/>
+          <w:sz w:val="22"/>
+        </w:rPr>
+        <w:t>Silver</w:t>
+      </w:r>
+      <w:r>
+        <w:rPr>
+          <w:rFonts w:ascii="Arial" w:hAnsi="Arial" w:eastAsia="Arial" w:cs="Arial"/>
+          <w:b w:val="0"/>
+          <w:i w:val="0"/>
+          <w:sz w:val="22"/>
+        </w:rPr>
+        <w:t xml:space="preserve"> (abu-abu logam), tekan 0 lalu Fit All. Di lembar: TechDraw → Views From Other Workbenches → </w:t>
+      </w:r>
+      <w:r>
+        <w:rPr>
+          <w:rFonts w:ascii="Arial" w:hAnsi="Arial" w:eastAsia="Arial" w:cs="Arial"/>
+          <w:b/>
+          <w:i w:val="0"/>
+          <w:sz w:val="22"/>
+        </w:rPr>
+        <w:t>Active View</w:t>
+      </w:r>
+      <w:r>
+        <w:rPr>
+          <w:rFonts w:ascii="Arial" w:hAnsi="Arial" w:eastAsia="Arial" w:cs="Arial"/>
+          <w:b w:val="0"/>
+          <w:i w:val="0"/>
+          <w:sz w:val="22"/>
+        </w:rPr>
+        <w:t xml:space="preserve">, centang </w:t>
+      </w:r>
+      <w:r>
+        <w:rPr>
+          <w:rFonts w:ascii="Arial" w:hAnsi="Arial" w:eastAsia="Arial" w:cs="Arial"/>
+          <w:b w:val="0"/>
+          <w:i/>
+          <w:sz w:val="22"/>
+        </w:rPr>
+        <w:t>No background</w:t>
+      </w:r>
+      <w:r>
+        <w:rPr>
+          <w:rFonts w:ascii="Arial" w:hAnsi="Arial" w:eastAsia="Arial" w:cs="Arial"/>
+          <w:b w:val="0"/>
+          <w:i w:val="0"/>
+          <w:sz w:val="22"/>
+        </w:rPr>
+        <w:t xml:space="preserve"> → OK: citra 3D berbayang masuk ke lembar. Data → Scale 0,761 agar lebar benda 63,6 mm (isometrik 1:2 = ½ × 180 × cos 30° × 0,816), X 172, Y 160 di atas pandangan Kanan.</w:t>
       </w:r>
     </w:p>
     <w:p>
@@ -12211,7 +12391,61 @@
           <w:i w:val="0"/>
           <w:sz w:val="22"/>
         </w:rPr>
-        <w:t>Pilih pandangan Top → Insert Section View: bidang melalui pusat lubang sejajar X, arah panah ke −Y, nama A. Tambahkan Hatch pada muka potongan dan periksa bagian di balik bidang.</w:t>
+        <w:t xml:space="preserve">Pilih pandangan Top → TechDraw Views → </w:t>
+      </w:r>
+      <w:r>
+        <w:rPr>
+          <w:rFonts w:ascii="Arial" w:hAnsi="Arial" w:eastAsia="Arial" w:cs="Arial"/>
+          <w:b/>
+          <w:i w:val="0"/>
+          <w:sz w:val="22"/>
+        </w:rPr>
+        <w:t>Section View</w:t>
+      </w:r>
+      <w:r>
+        <w:rPr>
+          <w:rFonts w:ascii="Arial" w:hAnsi="Arial" w:eastAsia="Arial" w:cs="Arial"/>
+          <w:b w:val="0"/>
+          <w:i w:val="0"/>
+          <w:sz w:val="22"/>
+        </w:rPr>
+        <w:t xml:space="preserve">: tombol </w:t>
+      </w:r>
+      <w:r>
+        <w:rPr>
+          <w:rFonts w:ascii="Arial" w:hAnsi="Arial" w:eastAsia="Arial" w:cs="Arial"/>
+          <w:b w:val="0"/>
+          <w:i/>
+          <w:sz w:val="22"/>
+        </w:rPr>
+        <w:t>Looking up</w:t>
+      </w:r>
+      <w:r>
+        <w:rPr>
+          <w:rFonts w:ascii="Arial" w:hAnsi="Arial" w:eastAsia="Arial" w:cs="Arial"/>
+          <w:b w:val="0"/>
+          <w:i w:val="0"/>
+          <w:sz w:val="22"/>
+        </w:rPr>
+        <w:t xml:space="preserve"> dulu (arah pandang +Y, searah pandangan Depan; kotak Identifier baru aktif setelah arah dipilih), lalu Identifier A; titik asal bidang potong (60, 30, 40) melewati pusat lubang → OK. Data → X 245, Y 100 (sebaris dengan Depan dan Kanan); </w:t>
+      </w:r>
+      <w:r>
+        <w:rPr>
+          <w:rFonts w:ascii="Arial" w:hAnsi="Arial" w:eastAsia="Arial" w:cs="Arial"/>
+          <w:b w:val="0"/>
+          <w:i/>
+          <w:sz w:val="22"/>
+        </w:rPr>
+        <w:t>Caption</w:t>
+      </w:r>
+      <w:r>
+        <w:rPr>
+          <w:rFonts w:ascii="Arial" w:hAnsi="Arial" w:eastAsia="Arial" w:cs="Arial"/>
+          <w:b w:val="0"/>
+          <w:i w:val="0"/>
+          <w:sz w:val="22"/>
+        </w:rPr>
+        <w:t xml:space="preserve"> “POTONGAN A-A”. Muka potongan diarsir otomatis.</w:t>
       </w:r>
     </w:p>
     <w:p>
@@ -12235,16 +12469,70 @@
           <w:i w:val="0"/>
           <w:sz w:val="22"/>
         </w:rPr>
-        <w:t xml:space="preserve">Dimensi, simbol, ekspor: </w:t>
-      </w:r>
-      <w:r>
-        <w:rPr>
-          <w:rFonts w:ascii="Arial" w:hAnsi="Arial" w:eastAsia="Arial" w:cs="Arial"/>
-          <w:b w:val="0"/>
-          <w:i w:val="0"/>
-          <w:sz w:val="22"/>
-        </w:rPr>
-        <w:t>Beri dimensi Length pada lebar dan tinggi, Diameter pada lubang; tulis metode proyeksi dan skala pada kepala gambar (simbol kerucut terpancung). Export Page as PDF.</w:t>
+        <w:t xml:space="preserve">Kepala gambar dan dimensi: </w:t>
+      </w:r>
+      <w:r>
+        <w:rPr>
+          <w:rFonts w:ascii="Arial" w:hAnsi="Arial" w:eastAsia="Arial" w:cs="Arial"/>
+          <w:b w:val="0"/>
+          <w:i w:val="0"/>
+          <w:sz w:val="22"/>
+        </w:rPr>
+        <w:t xml:space="preserve">Klik kolom kepala gambar: Title, Created by, Approved by (nama dosen pengampu), Document type, Part Material (ganti teks contoh template “Stainless steel Mat.No. 1.4301” dengan nama material yang dipasang: </w:t>
+      </w:r>
+      <w:r>
+        <w:rPr>
+          <w:rFonts w:ascii="Arial" w:hAnsi="Arial" w:eastAsia="Arial" w:cs="Arial"/>
+          <w:b w:val="0"/>
+          <w:i/>
+          <w:sz w:val="22"/>
+        </w:rPr>
+        <w:t>Steel-S275JR</w:t>
+      </w:r>
+      <w:r>
+        <w:rPr>
+          <w:rFonts w:ascii="Arial" w:hAnsi="Arial" w:eastAsia="Arial" w:cs="Arial"/>
+          <w:b w:val="0"/>
+          <w:i w:val="0"/>
+          <w:sz w:val="22"/>
+        </w:rPr>
+        <w:t xml:space="preserve">), Scale “1 : 2”. Klik tepi lubang di pandangan Atas → Circle Centerlines. Pandangan Atas memuat garis potong A-A, jadi </w:t>
+      </w:r>
+      <w:r>
+        <w:rPr>
+          <w:rFonts w:ascii="Arial" w:hAnsi="Arial" w:eastAsia="Arial" w:cs="Arial"/>
+          <w:b/>
+          <w:i w:val="0"/>
+          <w:sz w:val="22"/>
+        </w:rPr>
+        <w:t>tidak diberi dimensi</w:t>
+      </w:r>
+      <w:r>
+        <w:rPr>
+          <w:rFonts w:ascii="Arial" w:hAnsi="Arial" w:eastAsia="Arial" w:cs="Arial"/>
+          <w:b w:val="0"/>
+          <w:i w:val="0"/>
+          <w:sz w:val="22"/>
+        </w:rPr>
+        <w:t xml:space="preserve"> (angka akan menumpuk teks A-A). Depan: 120 (bawah) dan 60 (atas) dengan Length, 80 (kiri) dan 50 (kanan) dengan Vertical Length; Kanan: kedalaman 60 di bawah; Potongan A-A: rantai di atas, tepi kiri ke tepi celah 80 lalu lebar celah 20 → Format/Organize Dimensions → </w:t>
+      </w:r>
+      <w:r>
+        <w:rPr>
+          <w:rFonts w:ascii="Arial" w:hAnsi="Arial" w:eastAsia="Arial" w:cs="Arial"/>
+          <w:b w:val="0"/>
+          <w:i/>
+          <w:sz w:val="22"/>
+        </w:rPr>
+        <w:t>Insert ⌀ Prefix</w:t>
+      </w:r>
+      <w:r>
+        <w:rPr>
+          <w:rFonts w:ascii="Arial" w:hAnsi="Arial" w:eastAsia="Arial" w:cs="Arial"/>
+          <w:b w:val="0"/>
+          <w:i w:val="0"/>
+          <w:sz w:val="22"/>
+        </w:rPr>
+        <w:t xml:space="preserve"> menjadi ⌀20. Seret angka sehingga semua garis dimensi berjarak sama, 12 mm dari benda: angka dimensi di kanan benda berada di antara benda dan garisnya, jadi jarak ini memberi celah yang cukup.</w:t>
       </w:r>
     </w:p>
     <w:p>
@@ -12268,16 +12556,16 @@
           <w:i w:val="0"/>
           <w:sz w:val="22"/>
         </w:rPr>
-        <w:t xml:space="preserve">Bacaan dan simpan: </w:t>
-      </w:r>
-      <w:r>
-        <w:rPr>
-          <w:rFonts w:ascii="Arial" w:hAnsi="Arial" w:eastAsia="Arial" w:cs="Arial"/>
-          <w:b w:val="0"/>
-          <w:i w:val="0"/>
-          <w:sz w:val="22"/>
-        </w:rPr>
-        <w:t>Di Python: luas muka depan (Face.Area), BoundBox.DiagonalLength, luas potongan lewat slice pada bidang tengah kedalaman, y = (BoundBox.YMin + BoundBox.YMax)/2 = −30 (Pad dari sketsa XZ mengarah ke −Y); putar Body 25° terhadap Z dan baca XLength, lalu kembalikan ke 0°. Ctrl+S → Latihan6_NIM.FCStd (lembar TechDraw ikut tersimpan).</w:t>
+        <w:t xml:space="preserve">Bacaan, simpan, ekspor: </w:t>
+      </w:r>
+      <w:r>
+        <w:rPr>
+          <w:rFonts w:ascii="Arial" w:hAnsi="Arial" w:eastAsia="Arial" w:cs="Arial"/>
+          <w:b w:val="0"/>
+          <w:i w:val="0"/>
+          <w:sz w:val="22"/>
+        </w:rPr>
+        <w:t>Python console: luas muka depan [round(f.Area, 2) for f in App.ActiveDocument.Body.Shape.Faces if abs(f.CenterOfMass.y) &lt; 1e-6] → 7.800,0 mm²; luas potongan A-A pada y = 30: import Part lalu round(sum(Part.Face(w).Area for w in App.ActiveDocument.Body.Shape.slice(App.Vector(0, 1, 0), 30)), 2) → 6.800,0 mm² (= 7.800 − 20 × 50). Ctrl+S → Latihan6_NIM.FCStd (lembar TechDraw ikut tersimpan); File → Export PDF → Latihan6_NIM.pdf.</w:t>
       </w:r>
     </w:p>
     <w:p>

</xml_diff>